<commit_message>
Add runtime measurement and UI for grid pathfinding and puzzle solving
- Implemented `measure_search_run` function to track memory usage during search operations.
- Created `runtime.py` to house the memory measurement functionality.
- Developed a comprehensive UI in `ui.py` for grid pathfinding and puzzle solving tasks.
- Integrated algorithm selection, result display, and path visualization features.
- Added functionality for exporting paths and comparing multiple algorithms.
- Enhanced user interaction with grid and puzzle boards, including dynamic resizing and block management.
</commit_message>
<xml_diff>
--- a/Lab3/hash_report.docx
+++ b/Lab3/hash_report.docx
@@ -220,7 +220,7 @@
         <w:jc w:val="center"/>
         <w:rPr>
           <w:b/>
-          <w:lang w:val="en-US"/>
+          <w:lang w:val="ru-RU"/>
         </w:rPr>
       </w:pPr>
       <w:r>
@@ -233,7 +233,7 @@
       <w:r>
         <w:rPr>
           <w:b/>
-          <w:lang w:val="en-US"/>
+          <w:lang w:val="ru-RU"/>
         </w:rPr>
         <w:t>9</w:t>
       </w:r>
@@ -1677,7 +1677,7 @@
         <w:ind w:firstLine="567"/>
         <w:jc w:val="both"/>
         <w:rPr>
-          <w:lang w:val="en-US"/>
+          <w:lang w:val="ru-RU"/>
         </w:rPr>
       </w:pPr>
       <w:r>
@@ -2885,7 +2885,7 @@
         <w:ind w:firstLine="720"/>
         <w:jc w:val="both"/>
         <w:rPr>
-          <w:lang w:val="en-US"/>
+          <w:lang w:val="ru-RU"/>
         </w:rPr>
       </w:pPr>
       <w:r>
@@ -3735,7 +3735,7 @@
     <w:p>
       <w:pPr>
         <w:rPr>
-          <w:lang w:val="en-US"/>
+          <w:lang w:val="ru-RU"/>
         </w:rPr>
       </w:pPr>
     </w:p>
@@ -3747,7 +3747,7 @@
         <w:rPr>
           <w:sz w:val="24"/>
           <w:szCs w:val="24"/>
-          <w:lang w:val="en-US"/>
+          <w:lang w:val="ru-RU"/>
         </w:rPr>
       </w:pPr>
     </w:p>
@@ -3759,7 +3759,7 @@
         <w:rPr>
           <w:sz w:val="24"/>
           <w:szCs w:val="24"/>
-          <w:lang w:val="en-US"/>
+          <w:lang w:val="ru-RU"/>
         </w:rPr>
       </w:pPr>
     </w:p>
@@ -5232,7 +5232,6 @@
         </w:rPr>
         <w:t>«</w:t>
       </w:r>
-      <w:proofErr w:type="spellStart"/>
       <w:r>
         <w:rPr>
           <w:i/>
@@ -5241,7 +5240,6 @@
         </w:rPr>
         <w:t>Деперсонализировать</w:t>
       </w:r>
-      <w:proofErr w:type="spellEnd"/>
       <w:r>
         <w:rPr>
           <w:i/>
@@ -6123,6 +6121,9 @@
         <w:jc w:val="center"/>
       </w:pPr>
       <w:r>
+        <w:rPr>
+          <w:noProof/>
+        </w:rPr>
         <w:drawing>
           <wp:inline distT="0" distB="0" distL="0" distR="0" wp14:anchorId="326B4C7A" wp14:editId="33C4CC04">
             <wp:extent cx="5733415" cy="536575"/>
@@ -6164,9 +6165,6 @@
       <w:pPr>
         <w:pStyle w:val="ac"/>
         <w:jc w:val="center"/>
-        <w:rPr>
-          <w:lang w:val="en-US"/>
-        </w:rPr>
       </w:pPr>
       <w:r>
         <w:t xml:space="preserve">Рис. </w:t>
@@ -6260,6 +6258,7 @@
       </w:pPr>
       <w:r>
         <w:rPr>
+          <w:noProof/>
           <w:sz w:val="28"/>
           <w:szCs w:val="28"/>
         </w:rPr>
@@ -6322,10 +6321,7 @@
         <w:t xml:space="preserve"> </w:t>
       </w:r>
       <w:r>
-        <w:t xml:space="preserve">Пример </w:t>
-      </w:r>
-      <w:r>
-        <w:t>вычисления соли и записи номеров</w:t>
+        <w:t>Пример вычисления соли и записи номеров</w:t>
       </w:r>
     </w:p>
     <w:p>
@@ -6420,6 +6416,9 @@
         <w:jc w:val="center"/>
       </w:pPr>
       <w:r>
+        <w:rPr>
+          <w:noProof/>
+        </w:rPr>
         <w:drawing>
           <wp:inline distT="0" distB="0" distL="0" distR="0" wp14:anchorId="2D617A36" wp14:editId="6858223F">
             <wp:extent cx="1233729" cy="2543175"/>
@@ -6557,6 +6556,7 @@
       </w:pPr>
       <w:r>
         <w:rPr>
+          <w:noProof/>
           <w:sz w:val="28"/>
           <w:szCs w:val="28"/>
         </w:rPr>
@@ -6750,7 +6750,7 @@
       <w:pPr>
         <w:spacing w:line="360" w:lineRule="auto"/>
         <w:rPr>
-          <w:lang w:val="en-US"/>
+          <w:lang w:val="ru-RU"/>
         </w:rPr>
       </w:pPr>
       <w:r>
@@ -7079,7 +7079,7 @@
         <w:ind w:firstLine="709"/>
         <w:jc w:val="both"/>
         <w:rPr>
-          <w:lang w:val="en-US"/>
+          <w:lang w:val="ru-RU"/>
         </w:rPr>
       </w:pPr>
       <w:r>
@@ -7153,7 +7153,7 @@
         <w:ind w:left="360" w:firstLine="360"/>
         <w:jc w:val="both"/>
         <w:rPr>
-          <w:lang w:val="en-US"/>
+          <w:lang w:val="ru-RU"/>
         </w:rPr>
       </w:pPr>
       <w:r>
@@ -7206,7 +7206,21 @@
         <w:rPr>
           <w:lang w:val="ru-RU"/>
         </w:rPr>
-        <w:t xml:space="preserve">, ни длину номеров которые влияют на </w:t>
+        <w:t xml:space="preserve">, ни длину </w:t>
+      </w:r>
+      <w:proofErr w:type="gramStart"/>
+      <w:r>
+        <w:rPr>
+          <w:lang w:val="ru-RU"/>
+        </w:rPr>
+        <w:t>номеров</w:t>
+      </w:r>
+      <w:proofErr w:type="gramEnd"/>
+      <w:r>
+        <w:rPr>
+          <w:lang w:val="ru-RU"/>
+        </w:rPr>
+        <w:t xml:space="preserve"> которые влияют на </w:t>
       </w:r>
       <w:r>
         <w:rPr>
@@ -8157,6 +8171,9 @@
             <m:t>.</m:t>
           </m:r>
           <m:r>
+            <m:rPr>
+              <m:sty m:val="p"/>
+            </m:rPr>
             <w:rPr>
               <w:lang w:val="ru-RU"/>
             </w:rPr>
@@ -8257,14 +8274,7 @@
             <w:rFonts w:ascii="Cambria Math" w:hAnsi="Cambria Math"/>
             <w:lang w:val="ru-RU"/>
           </w:rPr>
-          <m:t>X</m:t>
-        </m:r>
-        <m:r>
-          <w:rPr>
-            <w:rFonts w:ascii="Cambria Math" w:hAnsi="Cambria Math"/>
-            <w:lang w:val="ru-RU"/>
-          </w:rPr>
-          <m:t xml:space="preserve"> </m:t>
+          <m:t xml:space="preserve">X </m:t>
         </m:r>
       </m:oMath>
       <w:r>
@@ -8433,21 +8443,7 @@
               <w:rFonts w:ascii="Cambria Math" w:hAnsi="Cambria Math"/>
               <w:lang w:val="ru-RU"/>
             </w:rPr>
-            <m:t>,</m:t>
-          </m:r>
-          <m:r>
-            <w:rPr>
-              <w:rFonts w:ascii="Cambria Math" w:hAnsi="Cambria Math"/>
-              <w:lang w:val="ru-RU"/>
-            </w:rPr>
-            <m:t xml:space="preserve">   </m:t>
-          </m:r>
-          <m:r>
-            <w:rPr>
-              <w:rFonts w:ascii="Cambria Math" w:hAnsi="Cambria Math"/>
-              <w:lang w:val="ru-RU"/>
-            </w:rPr>
-            <m:t>P(X≥1)=1-</m:t>
+            <m:t>,   P(X≥1)=1-</m:t>
           </m:r>
           <m:sSup>
             <m:sSupPr>
@@ -8488,6 +8484,9 @@
             <m:t>.</m:t>
           </m:r>
           <m:r>
+            <m:rPr>
+              <m:sty m:val="p"/>
+            </m:rPr>
             <w:rPr>
               <w:lang w:val="ru-RU"/>
             </w:rPr>
@@ -8664,7 +8663,6 @@
           </m:r>
           <m:r>
             <w:rPr>
-              <w:i/>
               <w:lang w:val="ru-RU"/>
             </w:rPr>
             <w:br/>
@@ -8724,6 +8722,9 @@
             <m:t>0.2212.</m:t>
           </m:r>
           <m:r>
+            <m:rPr>
+              <m:sty m:val="p"/>
+            </m:rPr>
             <w:rPr>
               <w:lang w:val="ru-RU"/>
             </w:rPr>
@@ -11120,6 +11121,7 @@
   <w:style w:type="character" w:default="1" w:styleId="a0">
     <w:name w:val="Default Paragraph Font"/>
     <w:uiPriority w:val="1"/>
+    <w:semiHidden/>
     <w:unhideWhenUsed/>
   </w:style>
   <w:style w:type="table" w:default="1" w:styleId="a1">

</xml_diff>